<commit_message>
Added central contact email address
</commit_message>
<xml_diff>
--- a/ODE4HERA Libraries Individual Contributor License Agreement.docx
+++ b/ODE4HERA Libraries Individual Contributor License Agreement.docx
@@ -144,7 +144,7 @@
             <w:rStyle w:val="Hyperlink"/>
             <w:lang w:val="en-US"/>
           </w:rPr>
-          <w:t>jasper.bussemaker@dlr.de</w:t>
+          <w:t>digital.engineering@dlr.de</w:t>
         </w:r>
       </w:hyperlink>
       <w:r>
@@ -431,21 +431,7 @@
         <w:rPr>
           <w:lang w:val="en-US"/>
         </w:rPr>
-        <w:t xml:space="preserve">, </w:t>
-      </w:r>
-      <w:proofErr w:type="gramStart"/>
-      <w:r>
-        <w:rPr>
-          <w:lang w:val="en-US"/>
-        </w:rPr>
-        <w:t>You</w:t>
-      </w:r>
-      <w:proofErr w:type="gramEnd"/>
-      <w:r>
-        <w:rPr>
-          <w:lang w:val="en-US"/>
-        </w:rPr>
-        <w:t xml:space="preserve"> reserve all right, title, and interest in and to Your Contributions.</w:t>
+        <w:t>, You reserve all right, title, and interest in and to Your Contributions.</w:t>
       </w:r>
     </w:p>
     <w:p>
@@ -678,21 +664,7 @@
         <w:rPr>
           <w:lang w:val="en-US"/>
         </w:rPr>
-        <w:t xml:space="preserve">Subject to the terms and conditions of this Agreement, </w:t>
-      </w:r>
-      <w:proofErr w:type="gramStart"/>
-      <w:r>
-        <w:rPr>
-          <w:lang w:val="en-US"/>
-        </w:rPr>
-        <w:t>You</w:t>
-      </w:r>
-      <w:proofErr w:type="gramEnd"/>
-      <w:r>
-        <w:rPr>
-          <w:lang w:val="en-US"/>
-        </w:rPr>
-        <w:t xml:space="preserve"> hereby grant to</w:t>
+        <w:t>Subject to the terms and conditions of this Agreement, You hereby grant to</w:t>
       </w:r>
       <w:r>
         <w:rPr>
@@ -788,13 +760,7 @@
         <w:rPr>
           <w:lang w:val="en-US"/>
         </w:rPr>
-        <w:t>organization</w:t>
-      </w:r>
-      <w:r>
-        <w:rPr>
-          <w:lang w:val="en-US"/>
-        </w:rPr>
-        <w:t xml:space="preserve"> </w:t>
+        <w:t xml:space="preserve">organization </w:t>
       </w:r>
       <w:r>
         <w:rPr>
@@ -1006,21 +972,7 @@
         <w:rPr>
           <w:lang w:val="en-US"/>
         </w:rPr>
-        <w:t xml:space="preserve">. Unless required by applicable law or agreed to in writing, </w:t>
-      </w:r>
-      <w:proofErr w:type="gramStart"/>
-      <w:r>
-        <w:rPr>
-          <w:lang w:val="en-US"/>
-        </w:rPr>
-        <w:t>You</w:t>
-      </w:r>
-      <w:proofErr w:type="gramEnd"/>
-      <w:r>
-        <w:rPr>
-          <w:lang w:val="en-US"/>
-        </w:rPr>
-        <w:t xml:space="preserve"> provide Your Contributions on an "AS IS" BASIS, WITHOUT WARRANTIES OR CONDITIONS OF ANY KIND, either express or implied, including, without limitation, any warranties or conditions of TITLE, NON-INFRINGEMENT, MERCHANTABILITY, or FITNESS FOR A PARTICULAR PURPOSE.</w:t>
+        <w:t>. Unless required by applicable law or agreed to in writing, You provide Your Contributions on an "AS IS" BASIS, WITHOUT WARRANTIES OR CONDITIONS OF ANY KIND, either express or implied, including, without limitation, any warranties or conditions of TITLE, NON-INFRINGEMENT, MERCHANTABILITY, or FITNESS FOR A PARTICULAR PURPOSE.</w:t>
       </w:r>
     </w:p>
     <w:p>
@@ -1034,21 +986,7 @@
         <w:rPr>
           <w:lang w:val="en-US"/>
         </w:rPr>
-        <w:t xml:space="preserve">Should You wish to submit work that is not Your original creation, </w:t>
-      </w:r>
-      <w:proofErr w:type="gramStart"/>
-      <w:r>
-        <w:rPr>
-          <w:lang w:val="en-US"/>
-        </w:rPr>
-        <w:t>You</w:t>
-      </w:r>
-      <w:proofErr w:type="gramEnd"/>
-      <w:r>
-        <w:rPr>
-          <w:lang w:val="en-US"/>
-        </w:rPr>
-        <w:t xml:space="preserve"> may submit it to</w:t>
+        <w:t>Should You wish to submit work that is not Your original creation, You may submit it to</w:t>
       </w:r>
       <w:r>
         <w:rPr>
@@ -2224,6 +2162,18 @@
       <w:spacing w:after="0" w:line="240" w:lineRule="auto"/>
     </w:pPr>
   </w:style>
+  <w:style w:type="character" w:styleId="UnresolvedMention">
+    <w:name w:val="Unresolved Mention"/>
+    <w:basedOn w:val="DefaultParagraphFont"/>
+    <w:uiPriority w:val="99"/>
+    <w:semiHidden/>
+    <w:unhideWhenUsed/>
+    <w:rsid w:val="00C76574"/>
+    <w:rPr>
+      <w:color w:val="605E5C"/>
+      <w:shd w:val="clear" w:color="auto" w:fill="E1DFDD"/>
+    </w:rPr>
+  </w:style>
 </w:styles>
 </file>
 
@@ -2513,10 +2463,21 @@
 </file>
 
 <file path=customXml/item1.xml><?xml version="1.0" encoding="utf-8"?>
-<b:Sources xmlns:b="http://schemas.openxmlformats.org/officeDocument/2006/bibliography" xmlns="http://schemas.openxmlformats.org/officeDocument/2006/bibliography" SelectedStyle="\APA.XSL" StyleName="APA"/>
+<p:properties xmlns:p="http://schemas.microsoft.com/office/2006/metadata/properties" xmlns:xsi="http://www.w3.org/2001/XMLSchema-instance" xmlns:pc="http://schemas.microsoft.com/office/infopath/2007/PartnerControls">
+  <documentManagement/>
+</p:properties>
 </file>
 
 <file path=customXml/item2.xml><?xml version="1.0" encoding="utf-8"?>
+<?mso-contentType ?>
+<FormTemplates xmlns="http://schemas.microsoft.com/sharepoint/v3/contenttype/forms">
+  <Display>DocumentLibraryForm</Display>
+  <Edit>DocumentLibraryForm</Edit>
+  <New>DocumentLibraryForm</New>
+</FormTemplates>
+</file>
+
+<file path=customXml/item3.xml><?xml version="1.0" encoding="utf-8"?>
 <ct:contentTypeSchema xmlns:ct="http://schemas.microsoft.com/office/2006/metadata/contentType" xmlns:ma="http://schemas.microsoft.com/office/2006/metadata/properties/metaAttributes" ct:_="" ma:_="" ma:contentTypeName="Dokument" ma:contentTypeID="0x010100451F011417559D4DB2D2C5A38463FC33" ma:contentTypeVersion="1" ma:contentTypeDescription="Ein neues Dokument erstellen." ma:contentTypeScope="" ma:versionID="4c75561b20939eb3150220048385ec87">
   <xsd:schema xmlns:xsd="http://www.w3.org/2001/XMLSchema" xmlns:xs="http://www.w3.org/2001/XMLSchema" xmlns:p="http://schemas.microsoft.com/office/2006/metadata/properties" targetNamespace="http://schemas.microsoft.com/office/2006/metadata/properties" ma:root="true" ma:fieldsID="b686dcd11d120f5ddbaa988a62e2b008">
     <xsd:element name="properties">
@@ -2630,30 +2591,28 @@
 </ct:contentTypeSchema>
 </file>
 
-<file path=customXml/item3.xml><?xml version="1.0" encoding="utf-8"?>
-<?mso-contentType ?>
-<FormTemplates xmlns="http://schemas.microsoft.com/sharepoint/v3/contenttype/forms">
-  <Display>DocumentLibraryForm</Display>
-  <Edit>DocumentLibraryForm</Edit>
-  <New>DocumentLibraryForm</New>
-</FormTemplates>
-</file>
-
 <file path=customXml/item4.xml><?xml version="1.0" encoding="utf-8"?>
-<p:properties xmlns:p="http://schemas.microsoft.com/office/2006/metadata/properties" xmlns:xsi="http://www.w3.org/2001/XMLSchema-instance" xmlns:pc="http://schemas.microsoft.com/office/infopath/2007/PartnerControls">
-  <documentManagement/>
-</p:properties>
+<b:Sources xmlns:b="http://schemas.openxmlformats.org/officeDocument/2006/bibliography" xmlns="http://schemas.openxmlformats.org/officeDocument/2006/bibliography" SelectedStyle="\APA.XSL" StyleName="APA"/>
 </file>
 
 <file path=customXml/itemProps1.xml><?xml version="1.0" encoding="utf-8"?>
-<ds:datastoreItem xmlns:ds="http://schemas.openxmlformats.org/officeDocument/2006/customXml" ds:itemID="{2A8DC255-45EE-4424-9DD0-0DBC711D6C0A}">
+<ds:datastoreItem xmlns:ds="http://schemas.openxmlformats.org/officeDocument/2006/customXml" ds:itemID="{FBDD14BB-5C8F-4617-8EE4-76D6894C4705}">
   <ds:schemaRefs>
-    <ds:schemaRef ds:uri="http://schemas.openxmlformats.org/officeDocument/2006/bibliography"/>
+    <ds:schemaRef ds:uri="http://schemas.microsoft.com/office/2006/metadata/properties"/>
+    <ds:schemaRef ds:uri="http://schemas.microsoft.com/office/infopath/2007/PartnerControls"/>
   </ds:schemaRefs>
 </ds:datastoreItem>
 </file>
 
 <file path=customXml/itemProps2.xml><?xml version="1.0" encoding="utf-8"?>
+<ds:datastoreItem xmlns:ds="http://schemas.openxmlformats.org/officeDocument/2006/customXml" ds:itemID="{0A1AA567-210A-4C34-9233-E00CF000F721}">
+  <ds:schemaRefs>
+    <ds:schemaRef ds:uri="http://schemas.microsoft.com/sharepoint/v3/contenttype/forms"/>
+  </ds:schemaRefs>
+</ds:datastoreItem>
+</file>
+
+<file path=customXml/itemProps3.xml><?xml version="1.0" encoding="utf-8"?>
 <ds:datastoreItem xmlns:ds="http://schemas.openxmlformats.org/officeDocument/2006/customXml" ds:itemID="{B3CE4D1D-1FFF-4638-82D3-C53C191702A9}">
   <ds:schemaRefs>
     <ds:schemaRef ds:uri="http://schemas.microsoft.com/office/2006/metadata/contentType"/>
@@ -2669,19 +2628,10 @@
 </ds:datastoreItem>
 </file>
 
-<file path=customXml/itemProps3.xml><?xml version="1.0" encoding="utf-8"?>
-<ds:datastoreItem xmlns:ds="http://schemas.openxmlformats.org/officeDocument/2006/customXml" ds:itemID="{0A1AA567-210A-4C34-9233-E00CF000F721}">
+<file path=customXml/itemProps4.xml><?xml version="1.0" encoding="utf-8"?>
+<ds:datastoreItem xmlns:ds="http://schemas.openxmlformats.org/officeDocument/2006/customXml" ds:itemID="{2A8DC255-45EE-4424-9DD0-0DBC711D6C0A}">
   <ds:schemaRefs>
-    <ds:schemaRef ds:uri="http://schemas.microsoft.com/sharepoint/v3/contenttype/forms"/>
-  </ds:schemaRefs>
-</ds:datastoreItem>
-</file>
-
-<file path=customXml/itemProps4.xml><?xml version="1.0" encoding="utf-8"?>
-<ds:datastoreItem xmlns:ds="http://schemas.openxmlformats.org/officeDocument/2006/customXml" ds:itemID="{FBDD14BB-5C8F-4617-8EE4-76D6894C4705}">
-  <ds:schemaRefs>
-    <ds:schemaRef ds:uri="http://schemas.microsoft.com/office/2006/metadata/properties"/>
-    <ds:schemaRef ds:uri="http://schemas.microsoft.com/office/infopath/2007/PartnerControls"/>
+    <ds:schemaRef ds:uri="http://schemas.openxmlformats.org/officeDocument/2006/bibliography"/>
   </ds:schemaRefs>
 </ds:datastoreItem>
 </file>
</xml_diff>